<commit_message>
Regenerate figures after NS/BH fix and styling pass
Co-authored-by: Cursor <cursoragent@cursor.com>
</commit_message>
<xml_diff>
--- a/docs/Figure_Dataset_Reference_Analysis.docx
+++ b/docs/Figure_Dataset_Reference_Analysis.docx
@@ -27,7 +27,7 @@
       <w:r>
         <w:t>Open a terminal in the project folder and run:  python main.py</w:t>
         <w:br/>
-        <w:t>Requires: pip install -r requirements.txt (once). Outputs: five PDFs in figures/ and processed tables in processed/.</w:t>
+        <w:t>Requires: pip install -r requirements.txt (once). Outputs: six PDFs in figures/ and processed tables in processed/.</w:t>
       </w:r>
     </w:p>
     <w:p>
@@ -100,7 +100,7 @@
         <w:t xml:space="preserve">Notes. </w:t>
       </w:r>
       <w:r>
-        <w:t>Literature overlays (not data): Chaisson living envelope (0.1–10 W·kg⁻¹; Chaisson 2003, 2011); Chaisson (2001) benchmarks for the Sun, a human body, and modern society; van Duin (2024) stability limit at 10⁵ W·kg⁻¹. Scatter only — no error bars on this panel.</w:t>
+        <w:t>Literature overlays (not data): Chaisson (2001) modern society benchmark (~50 W·kg⁻¹); van Duin (2024) stability limit at 10⁵ W·kg⁻¹. WDs: green = Dubus Table A.2 (general CVs), fuchsia = Table A.3 (nova-like); YSO: open yellow rings on top. No error bars on this panel — see figure_wd_dubus_uncertainties.pdf.</w:t>
       </w:r>
     </w:p>
     <w:p/>
@@ -153,7 +153,7 @@
         <w:t xml:space="preserve">Notes. </w:t>
       </w:r>
       <w:r>
-        <w:t>Literature overlays (not data): Chaisson living envelope (0.1–10 W·kg⁻¹; Chaisson 2003, 2011); Chaisson (2001) benchmarks for the Sun, a human body, and modern society; van Duin (2024) stability limit at 10⁵ W·kg⁻¹.</w:t>
+        <w:t>Literature overlays (not data): Chaisson (2001) modern society benchmark (~50 W·kg⁻¹); van Duin (2024) stability limit at 10⁵ W·kg⁻¹.</w:t>
       </w:r>
     </w:p>
     <w:p/>
@@ -259,7 +259,7 @@
         <w:t xml:space="preserve">Notes. </w:t>
       </w:r>
       <w:r>
-        <w:t>No YSO overlay. van Duin stability line shown; no Chaisson envelope.</w:t>
+        <w:t>WD colors: green = Dubus Table A.2 (general CVs), fuchsia = Table A.3 (nova-like). No YSO overlay. van Duin stability line shown; no Chaisson overlays.</w:t>
       </w:r>
     </w:p>
     <w:p/>
@@ -312,7 +312,60 @@
         <w:t xml:space="preserve">Notes. </w:t>
       </w:r>
       <w:r>
-        <w:t>Error bars only on this figure. No literature reference overlays.</w:t>
+        <w:t>Error bars only on this figure. Green = Dubus Table A.2; fuchsia = Table A.3. No literature reference overlays.</w:t>
+      </w:r>
+    </w:p>
+    <w:p/>
+    <w:p>
+      <w:pPr>
+        <w:pStyle w:val="Heading2"/>
+      </w:pPr>
+      <w:r>
+        <w:t>figure_smbh_seyfert1.pdf</w:t>
+      </w:r>
+    </w:p>
+    <w:p>
+      <w:r>
+        <w:rPr>
+          <w:b/>
+        </w:rPr>
+        <w:t xml:space="preserve">Purpose. </w:t>
+      </w:r>
+      <w:r>
+        <w:t>Test panel for Seyfert 1 supermassive black holes — separate from the unified master continuum.</w:t>
+      </w:r>
+    </w:p>
+    <w:p>
+      <w:r>
+        <w:rPr>
+          <w:b/>
+        </w:rPr>
+        <w:t xml:space="preserve">Data source. </w:t>
+      </w:r>
+      <w:r>
+        <w:t>Vidal (2020) Table 5 — 16 Seyfert 1 SMBHs from Meyer-Hofmeister &amp; Meyer (2011), parsed from references/Vidal-2020 PDF into data/compact/vidal_2020_table5_smbh_seyfert1.csv.</w:t>
+      </w:r>
+    </w:p>
+    <w:p>
+      <w:r>
+        <w:rPr>
+          <w:b/>
+        </w:rPr>
+        <w:t xml:space="preserve">Equations. </w:t>
+      </w:r>
+      <w:r>
+        <w:t>Tabulated ERD (erg·s⁻¹·g⁻¹) at η = 0.1 per Vidal; Φ_m = L/M in W·kg⁻¹. Schwarzschild radius used for the gravitational-efficiency track when computing from Ṁ; tabulated ERD overrides when both are present.</w:t>
+      </w:r>
+    </w:p>
+    <w:p>
+      <w:r>
+        <w:rPr>
+          <w:b/>
+        </w:rPr>
+        <w:t xml:space="preserve">Notes. </w:t>
+      </w:r>
+      <w:r>
+        <w:t>Not plotted on figure_unified_master.pdf. Chaisson modern society benchmark shown; no error bars (none in source table).</w:t>
       </w:r>
     </w:p>
     <w:p/>

</xml_diff>

<commit_message>
WD uncertainties, SI tables, SMBH on master, WD ?=0.007, SMBH ?=0.057
Done:

- figure_compact_objects.pdf updated with WD uncertainties (Dubus 2018)
- Data tables updated with good data + SI units (kg, W, W?kg??)
- SMBH data plotted on unified master (16 Seyfert 1 systems)
- New SI CSV: processed/power_density_si.csv (1,139 rows)
- WD power density recomputed at ? = 0.007 (nuclear fusion)
- SMBH power density at low efficiency limit ? = 0.057
  (Frank et al. 2002 thin-disc ISCO floor for non-rotating BH)

Co-authored-by: Cursor <cursoragent@cursor.com>
</commit_message>
<xml_diff>
--- a/docs/Figure_Dataset_Reference_Analysis.docx
+++ b/docs/Figure_Dataset_Reference_Analysis.docx
@@ -12,7 +12,7 @@
     </w:p>
     <w:p>
       <w:r>
-        <w:t>Updated 24 June 2026. Brief guide to each PDF in figures/: what it shows, where the data come from, and the equations used. Colors and markers are defined in the figure legends.</w:t>
+        <w:t>Updated 25 June 2026. Brief guide to each PDF in figures/: what it shows, where the data come from, and the equations used. Colors and markers are defined in the figure legends.</w:t>
       </w:r>
     </w:p>
     <w:p>
@@ -67,7 +67,7 @@
         <w:t xml:space="preserve">Purpose. </w:t>
       </w:r>
       <w:r>
-        <w:t>Overview of the full power-density continuum — biology, young stellar objects (YSOs), and accreting compact objects on one log–log plot.</w:t>
+        <w:t>Overview of the full power-density continuum — biology, young stellar objects (YSOs), accreting compact objects, and Seyfert 1 supermassive black holes on one log–log plot.</w:t>
       </w:r>
     </w:p>
     <w:p>
@@ -78,7 +78,7 @@
         <w:t xml:space="preserve">Data source. </w:t>
       </w:r>
       <w:r>
-        <w:t>Biology — van Duin et al. (2024) MOESM1 Section I (data/biology/von_duin_2024_erd_moesm1.csv; 805 measurements). YSOs — Manara et al. (2022) PPVII compilation (data/yso/mdots_forclement.dat; 139 systems; Alcalá+2017 &amp; Manara+2017 filter; Somers 2020 SPOTS masses). Compact objects — Vidal (2020) tables (data/compact/Power density data.csv; 130 white dwarfs [Dubus et al. 2018], 30 neutron stars [Galloway et al. 2008], 19 black holes [Coriat et al. 2012]).</w:t>
+        <w:t>Biology — van Duin et al. (2024) MOESM1 Section I (data/biology/von_duin_2024_erd_moesm1.csv; 805 measurements). YSOs — Manara et al. (2022) PPVII compilation (data/yso/mdots_forclement.dat; 139 systems; Alcalá+2017 &amp; Manara+2017 filter; Somers 2020 SPOTS masses). Compact objects — Vidal (2020) tables (data/compact/Power density data.csv; 130 white dwarfs [Dubus et al. 2018], 30 neutron stars [Galloway et al. 2008], 19 black holes [Coriat et al. 2012]). SMBHs — Vidal (2020) Table 5 (data/compact/vidal_2020_table5_smbh_seyfert1.csv; 16 Seyfert 1 systems [Meyer-Hofmeister &amp; Meyer 2011]).</w:t>
       </w:r>
     </w:p>
     <w:p>
@@ -89,7 +89,7 @@
         <w:t xml:space="preserve">Equations. </w:t>
       </w:r>
       <w:r>
-        <w:t>All panels use Φ_m = L / M (W·kg⁻¹, mass in kg). Biology: Φ_m from tabulated empirical ERD. YSOs: Φ_m = L_acc / M★. Compact objects: η = GM/(Rc²), L = η Ṁ c², Φ_m = L/M; tabulated ERD used when available.</w:t>
+        <w:t>All panels use Φ_m = L / M (W·kg⁻¹, mass in kg). Biology: Φ_m from tabulated empirical ERD. YSOs: Φ_m = L_acc / M★. WDs: η = 0.007 (nuclear fusion), L = η Ṁ c², Φ_m = L/M from tabulated Ṁ. NS/BH: η = GM/(Rc²), L = η Ṁ c², Φ_m = L/M; tabulated ERD used when available.</w:t>
       </w:r>
     </w:p>
     <w:p>
@@ -100,7 +100,7 @@
         <w:t xml:space="preserve">Notes. </w:t>
       </w:r>
       <w:r>
-        <w:t>Literature overlays (not data): Chaisson (2001) modern society benchmark (~50 W·kg⁻¹); van Duin (2024) stability limit at 10⁵ W·kg⁻¹. WDs: green = Dubus Table A.2 (general CVs), fuchsia = Table A.3 (nova-like); YSO: open yellow rings on top. No error bars on this panel — see figure_wd_dubus_uncertainties.pdf.</w:t>
+        <w:t>Literature overlay (not data): van Duin (2024) stability limit at 10⁵ W·kg⁻¹. WDs: green = Dubus Table A.2 (general CVs), fuchsia = Table A.3 (nova-like); SMBHs: violet filled circles; YSO: open yellow rings on top. No error bars on this panel — see figure_wd_dubus_uncertainties.pdf.</w:t>
       </w:r>
     </w:p>
     <w:p/>
@@ -153,60 +153,7 @@
         <w:t xml:space="preserve">Notes. </w:t>
       </w:r>
       <w:r>
-        <w:t>Literature overlays (not data): Chaisson (2001) modern society benchmark (~50 W·kg⁻¹); van Duin (2024) stability limit at 10⁵ W·kg⁻¹.</w:t>
-      </w:r>
-    </w:p>
-    <w:p/>
-    <w:p>
-      <w:pPr>
-        <w:pStyle w:val="Heading2"/>
-      </w:pPr>
-      <w:r>
-        <w:t>figure_yso.pdf</w:t>
-      </w:r>
-    </w:p>
-    <w:p>
-      <w:r>
-        <w:rPr>
-          <w:b/>
-        </w:rPr>
-        <w:t xml:space="preserve">Purpose. </w:t>
-      </w:r>
-      <w:r>
-        <w:t>Abiotic control sample — accreting young stars only, without biology or compact objects.</w:t>
-      </w:r>
-    </w:p>
-    <w:p>
-      <w:r>
-        <w:rPr>
-          <w:b/>
-        </w:rPr>
-        <w:t xml:space="preserve">Data source. </w:t>
-      </w:r>
-      <w:r>
-        <w:t>Manara et al. (2022) PPVII → mdots_forclement.dat (139 systems). Stellar masses from Baraffe+2015 with Somers (2020) SPOTS correction (17% spot coverage).</w:t>
-      </w:r>
-    </w:p>
-    <w:p>
-      <w:r>
-        <w:rPr>
-          <w:b/>
-        </w:rPr>
-        <w:t xml:space="preserve">Equations. </w:t>
-      </w:r>
-      <w:r>
-        <w:t>Φ_m = L_acc / M★, with L_acc = 10^(log L_acc) × L☉.</w:t>
-      </w:r>
-    </w:p>
-    <w:p>
-      <w:r>
-        <w:rPr>
-          <w:b/>
-        </w:rPr>
-        <w:t xml:space="preserve">Notes. </w:t>
-      </w:r>
-      <w:r>
-        <w:t>Empirical scatter only; no literature reference overlays.</w:t>
+        <w:t>Literature overlay (not data): van Duin (2024) stability limit at 10⁵ W·kg⁻¹.</w:t>
       </w:r>
     </w:p>
     <w:p/>
@@ -248,7 +195,7 @@
         <w:t xml:space="preserve">Equations. </w:t>
       </w:r>
       <w:r>
-        <w:t>η_grav = GM/(Rc²); L = η Ṁ c²; Φ_m = L/M. Tabulated ERD overrides the computed value when both are present.</w:t>
+        <w:t>WDs: η = 0.007 (nuclear fusion), L = η Ṁ c², Φ_m = L/M from tabulated Ṁ. NS/BH: η_grav = GM/(Rc²); L = η Ṁ c²; Φ_m = L/M. Tabulated ERD overrides the computed value when both are present (NS/BH only).</w:t>
       </w:r>
     </w:p>
     <w:p>
@@ -259,7 +206,7 @@
         <w:t xml:space="preserve">Notes. </w:t>
       </w:r>
       <w:r>
-        <w:t>WD colors: green = Dubus Table A.2 (general CVs), fuchsia = Table A.3 (nova-like). No YSO overlay. van Duin stability line shown; no Chaisson overlays.</w:t>
+        <w:t>WD colors: green = Dubus Table A.2 (general CVs), fuchsia = Table A.3 (nova-like). WD error bars: Dubus (2018) M₁ and Ṁ uncertainties (same as figure_wd_dubus_uncertainties.pdf). NS/BH: scatter only. No YSO overlay. van Duin stability line shown.</w:t>
       </w:r>
     </w:p>
     <w:p/>
@@ -332,7 +279,7 @@
         <w:t xml:space="preserve">Purpose. </w:t>
       </w:r>
       <w:r>
-        <w:t>Test panel for Seyfert 1 supermassive black holes — separate from the unified master continuum.</w:t>
+        <w:t>Zoomed test panel for Seyfert 1 supermassive black holes — same cohort as on the unified master.</w:t>
       </w:r>
     </w:p>
     <w:p>
@@ -365,7 +312,7 @@
         <w:t xml:space="preserve">Notes. </w:t>
       </w:r>
       <w:r>
-        <w:t>Not plotted on figure_unified_master.pdf. Chaisson modern society benchmark shown; no error bars (none in source table).</w:t>
+        <w:t>Also plotted on figure_unified_master.pdf. No error bars (none in source table).</w:t>
       </w:r>
     </w:p>
     <w:p/>

</xml_diff>